<commit_message>
Fix: imzo kutayotgan xatlar bosh sahifa hisobiga qo'shildi; tasdiqlangandan keyin QR'li yakuniy fayl yuklanadi; 1-ogohlantirish shabloni yangilandi
</commit_message>
<xml_diff>
--- a/templates/1-OGOHLANTIRISH-NAMUNA.docx
+++ b/templates/1-OGOHLANTIRISH-NAMUNA.docx
@@ -165,7 +165,17 @@
                 <w:szCs w:val="26"/>
                 <w:lang w:val="en-US"/>
               </w:rPr>
-              <w:t xml:space="preserve"> istiqomat qiluvchi fuqaro</w:t>
+              <w:t>da</w:t>
+            </w:r>
+            <w:r>
+              <w:rPr>
+                <w:rFonts w:ascii="Times New Roman" w:hAnsi="Times New Roman" w:cs="Times New Roman"/>
+                <w:b/>
+                <w:sz w:val="26"/>
+                <w:szCs w:val="26"/>
+                <w:lang w:val="en-US"/>
+              </w:rPr>
+              <w:t xml:space="preserve"> istiqomat qiluvchi </w:t>
             </w:r>
           </w:p>
           <w:p>
@@ -179,6 +189,36 @@
                 <w:lang w:val="en-US"/>
               </w:rPr>
             </w:pPr>
+            <w:r>
+              <w:rPr>
+                <w:rFonts w:ascii="Times New Roman" w:hAnsi="Times New Roman" w:cs="Times New Roman"/>
+                <w:b/>
+                <w:sz w:val="26"/>
+                <w:szCs w:val="26"/>
+                <w:lang w:val="en-US"/>
+              </w:rPr>
+              <w:t>f</w:t>
+            </w:r>
+            <w:r>
+              <w:rPr>
+                <w:rFonts w:ascii="Times New Roman" w:hAnsi="Times New Roman" w:cs="Times New Roman"/>
+                <w:b/>
+                <w:sz w:val="26"/>
+                <w:szCs w:val="26"/>
+                <w:lang w:val="en-US"/>
+              </w:rPr>
+              <w:t>uqaro</w:t>
+            </w:r>
+            <w:r>
+              <w:rPr>
+                <w:rFonts w:ascii="Times New Roman" w:hAnsi="Times New Roman" w:cs="Times New Roman"/>
+                <w:b/>
+                <w:sz w:val="26"/>
+                <w:szCs w:val="26"/>
+                <w:lang w:val="en-US"/>
+              </w:rPr>
+              <w:t xml:space="preserve"> </w:t>
+            </w:r>
             <w:r>
               <w:rPr>
                 <w:rFonts w:ascii="Times New Roman" w:hAnsi="Times New Roman" w:cs="Times New Roman"/>
@@ -328,7 +368,15 @@
           <w:szCs w:val="26"/>
           <w:lang w:val="en-US"/>
         </w:rPr>
-        <w:t>tuzilgan_</w:t>
+        <w:t>tuzilgan_kun</w:t>
+      </w:r>
+      <w:r>
+        <w:rPr>
+          <w:rFonts w:ascii="Times New Roman" w:hAnsi="Times New Roman" w:cs="Times New Roman"/>
+          <w:sz w:val="26"/>
+          <w:szCs w:val="26"/>
+        </w:rPr>
+        <w:t>}-{shartnoma_</w:t>
       </w:r>
       <w:r>
         <w:rPr>
@@ -337,33 +385,7 @@
           <w:szCs w:val="26"/>
           <w:lang w:val="en-US"/>
         </w:rPr>
-        <w:t>kun</w:t>
-      </w:r>
-      <w:r>
-        <w:rPr>
-          <w:rFonts w:ascii="Times New Roman" w:hAnsi="Times New Roman" w:cs="Times New Roman"/>
-          <w:sz w:val="26"/>
-          <w:szCs w:val="26"/>
-        </w:rPr>
-        <w:t>}-{shartnoma_</w:t>
-      </w:r>
-      <w:r>
-        <w:rPr>
-          <w:rFonts w:ascii="Times New Roman" w:hAnsi="Times New Roman" w:cs="Times New Roman"/>
-          <w:sz w:val="26"/>
-          <w:szCs w:val="26"/>
-          <w:lang w:val="en-US"/>
-        </w:rPr>
-        <w:t>tuzilgan_</w:t>
-      </w:r>
-      <w:r>
-        <w:rPr>
-          <w:rFonts w:ascii="Times New Roman" w:hAnsi="Times New Roman" w:cs="Times New Roman"/>
-          <w:sz w:val="26"/>
-          <w:szCs w:val="26"/>
-          <w:lang w:val="en-US"/>
-        </w:rPr>
-        <w:t>oy</w:t>
+        <w:t>tuzilgan_oy</w:t>
       </w:r>
       <w:r>
         <w:rPr>
@@ -448,7 +470,7 @@
           <w:sz w:val="26"/>
           <w:szCs w:val="26"/>
         </w:rPr>
-        <w:t>Mazkur holatga ko‘ra, Siz tomoningizdan iyul oyi uchun to‘lanishi lozim bo‘lgan to‘lov {kechikkan_kun} (({kechikkan_kun</w:t>
+        <w:t>Mazkur holatga ko‘ra, Siz tomoningizdan iyul oyi uchun to‘lanishi lozim bo‘lgan to‘lov {kechikkan_kun} ({kechikkan_kun</w:t>
       </w:r>
       <w:r>
         <w:rPr>
@@ -3046,6 +3068,7 @@
   <w:style w:type="character" w:default="1" w:styleId="a0">
     <w:name w:val="Default Paragraph Font"/>
     <w:uiPriority w:val="1"/>
+    <w:semiHidden/>
     <w:unhideWhenUsed/>
   </w:style>
   <w:style w:type="table" w:default="1" w:styleId="a1">

</xml_diff>